<commit_message>
docs: add newsletter drafting section to feature list + website copy
</commit_message>
<xml_diff>
--- a/docs/alwaysready-feature-list.docx
+++ b/docs/alwaysready-feature-list.docx
@@ -3208,6 +3208,314 @@
       </w:pPr>
       <w:r>
         <w:t xml:space="preserve"/>
+      </w:r>
+    </w:p>
+    <w:p>
+      <w:pPr>
+        <w:pStyle w:val="Heading1"/>
+        <w:pBdr>
+          <w:bottom w:val="single" w:color="00b8a6" w:sz="6" w:space="4"/>
+        </w:pBdr>
+        <w:spacing w:after="120" w:before="360"/>
+      </w:pPr>
+      <w:r>
+        <w:rPr>
+          <w:rFonts w:ascii="Calibri" w:cs="Calibri" w:eastAsia="Calibri" w:hAnsi="Calibri"/>
+          <w:b/>
+          <w:bCs/>
+          <w:color w:val="014D4E"/>
+          <w:sz w:val="26"/>
+          <w:szCs w:val="26"/>
+        </w:rPr>
+        <w:t xml:space="preserve">14. Newsletter Drafting</w:t>
+      </w:r>
+    </w:p>
+    <w:p>
+      <w:pPr>
+        <w:pStyle w:val="ListParagraph"/>
+        <w:numPr>
+          <w:ilvl w:val="0"/>
+          <w:numId w:val="2"/>
+        </w:numPr>
+        <w:spacing w:after="60" w:before="60"/>
+      </w:pPr>
+      <w:r>
+        <w:rPr>
+          <w:rFonts w:ascii="Calibri" w:cs="Calibri" w:eastAsia="Calibri" w:hAnsi="Calibri"/>
+          <w:b/>
+          <w:bCs/>
+          <w:color w:val="1a1a1a"/>
+          <w:sz w:val="20"/>
+          <w:szCs w:val="20"/>
+        </w:rPr>
+        <w:t xml:space="preserve">AI-powered draft generation</w:t>
+      </w:r>
+      <w:r>
+        <w:rPr>
+          <w:rFonts w:ascii="Calibri" w:cs="Calibri" w:eastAsia="Calibri" w:hAnsi="Calibri"/>
+          <w:b w:val="false"/>
+          <w:bCs w:val="false"/>
+          <w:color w:val="1a1a1a"/>
+          <w:sz w:val="20"/>
+          <w:szCs w:val="20"/>
+        </w:rPr>
+        <w:t xml:space="preserve"> — Tell the platform who the newsletter is for, choose a topic or occasion, add any key points, and pick a tone. AlwaysReady generates a ready-to-use draft in seconds.</w:t>
+      </w:r>
+    </w:p>
+    <w:p>
+      <w:pPr>
+        <w:pStyle w:val="ListParagraph"/>
+        <w:numPr>
+          <w:ilvl w:val="0"/>
+          <w:numId w:val="2"/>
+        </w:numPr>
+        <w:spacing w:after="60" w:before="60"/>
+      </w:pPr>
+      <w:r>
+        <w:rPr>
+          <w:rFonts w:ascii="Calibri" w:cs="Calibri" w:eastAsia="Calibri" w:hAnsi="Calibri"/>
+          <w:b/>
+          <w:bCs/>
+          <w:color w:val="1a1a1a"/>
+          <w:sz w:val="20"/>
+          <w:szCs w:val="20"/>
+        </w:rPr>
+        <w:t xml:space="preserve">Three audience options</w:t>
+      </w:r>
+      <w:r>
+        <w:rPr>
+          <w:rFonts w:ascii="Calibri" w:cs="Calibri" w:eastAsia="Calibri" w:hAnsi="Calibri"/>
+          <w:b w:val="false"/>
+          <w:bCs w:val="false"/>
+          <w:color w:val="1a1a1a"/>
+          <w:sz w:val="20"/>
+          <w:szCs w:val="20"/>
+        </w:rPr>
+        <w:t xml:space="preserve"> — Draft newsletters for your staff team, for families and residents, or for both at once. The opening salutation and tone adjust automatically to match.</w:t>
+      </w:r>
+    </w:p>
+    <w:p>
+      <w:pPr>
+        <w:pStyle w:val="ListParagraph"/>
+        <w:numPr>
+          <w:ilvl w:val="0"/>
+          <w:numId w:val="2"/>
+        </w:numPr>
+        <w:spacing w:after="60" w:before="60"/>
+      </w:pPr>
+      <w:r>
+        <w:rPr>
+          <w:rFonts w:ascii="Calibri" w:cs="Calibri" w:eastAsia="Calibri" w:hAnsi="Calibri"/>
+          <w:b/>
+          <w:bCs/>
+          <w:color w:val="1a1a1a"/>
+          <w:sz w:val="20"/>
+          <w:szCs w:val="20"/>
+        </w:rPr>
+        <w:t xml:space="preserve">Common care home occasions built in</w:t>
+      </w:r>
+      <w:r>
+        <w:rPr>
+          <w:rFonts w:ascii="Calibri" w:cs="Calibri" w:eastAsia="Calibri" w:hAnsi="Calibri"/>
+          <w:b w:val="false"/>
+          <w:bCs w:val="false"/>
+          <w:color w:val="1a1a1a"/>
+          <w:sz w:val="20"/>
+          <w:szCs w:val="20"/>
+        </w:rPr>
+        <w:t xml:space="preserve"> — Monthly update, upcoming CQC inspection, policy change, seasonal message, staff recognition, CQC rating update, new staff members, and service changes are all pre-loaded as topic options.</w:t>
+      </w:r>
+    </w:p>
+    <w:p>
+      <w:pPr>
+        <w:pStyle w:val="ListParagraph"/>
+        <w:numPr>
+          <w:ilvl w:val="0"/>
+          <w:numId w:val="2"/>
+        </w:numPr>
+        <w:spacing w:after="60" w:before="60"/>
+      </w:pPr>
+      <w:r>
+        <w:rPr>
+          <w:rFonts w:ascii="Calibri" w:cs="Calibri" w:eastAsia="Calibri" w:hAnsi="Calibri"/>
+          <w:b/>
+          <w:bCs/>
+          <w:color w:val="1a1a1a"/>
+          <w:sz w:val="20"/>
+          <w:szCs w:val="20"/>
+        </w:rPr>
+        <w:t xml:space="preserve">Tone selector</w:t>
+      </w:r>
+      <w:r>
+        <w:rPr>
+          <w:rFonts w:ascii="Calibri" w:cs="Calibri" w:eastAsia="Calibri" w:hAnsi="Calibri"/>
+          <w:b w:val="false"/>
+          <w:bCs w:val="false"/>
+          <w:color w:val="1a1a1a"/>
+          <w:sz w:val="20"/>
+          <w:szCs w:val="20"/>
+        </w:rPr>
+        <w:t xml:space="preserve"> — Choose from Warm and friendly, Professional, or Brief and factual. The writing style adjusts to match your preference and your audience.</w:t>
+      </w:r>
+    </w:p>
+    <w:p>
+      <w:pPr>
+        <w:pStyle w:val="ListParagraph"/>
+        <w:numPr>
+          <w:ilvl w:val="0"/>
+          <w:numId w:val="2"/>
+        </w:numPr>
+        <w:spacing w:after="60" w:before="60"/>
+      </w:pPr>
+      <w:r>
+        <w:rPr>
+          <w:rFonts w:ascii="Calibri" w:cs="Calibri" w:eastAsia="Calibri" w:hAnsi="Calibri"/>
+          <w:b/>
+          <w:bCs/>
+          <w:color w:val="1a1a1a"/>
+          <w:sz w:val="20"/>
+          <w:szCs w:val="20"/>
+        </w:rPr>
+        <w:t xml:space="preserve">Key points you supply, copy that reads naturally</w:t>
+      </w:r>
+      <w:r>
+        <w:rPr>
+          <w:rFonts w:ascii="Calibri" w:cs="Calibri" w:eastAsia="Calibri" w:hAnsi="Calibri"/>
+          <w:b w:val="false"/>
+          <w:bCs w:val="false"/>
+          <w:color w:val="1a1a1a"/>
+          <w:sz w:val="20"/>
+          <w:szCs w:val="20"/>
+        </w:rPr>
+        <w:t xml:space="preserve"> — Add bullet points or a few lines of notes — dates, names, announcements — and the AI weaves them into a coherent, well-written newsletter. No writing skills needed.</w:t>
+      </w:r>
+    </w:p>
+    <w:p>
+      <w:pPr>
+        <w:pStyle w:val="ListParagraph"/>
+        <w:numPr>
+          <w:ilvl w:val="0"/>
+          <w:numId w:val="2"/>
+        </w:numPr>
+        <w:spacing w:after="60" w:before="60"/>
+      </w:pPr>
+      <w:r>
+        <w:rPr>
+          <w:rFonts w:ascii="Calibri" w:cs="Calibri" w:eastAsia="Calibri" w:hAnsi="Calibri"/>
+          <w:b/>
+          <w:bCs/>
+          <w:color w:val="1a1a1a"/>
+          <w:sz w:val="20"/>
+          <w:szCs w:val="20"/>
+        </w:rPr>
+        <w:t xml:space="preserve">One-click copy</w:t>
+      </w:r>
+      <w:r>
+        <w:rPr>
+          <w:rFonts w:ascii="Calibri" w:cs="Calibri" w:eastAsia="Calibri" w:hAnsi="Calibri"/>
+          <w:b w:val="false"/>
+          <w:bCs w:val="false"/>
+          <w:color w:val="1a1a1a"/>
+          <w:sz w:val="20"/>
+          <w:szCs w:val="20"/>
+        </w:rPr>
+        <w:t xml:space="preserve"> — Copy the finished draft to your clipboard and paste it directly into your email, WhatsApp message, printed notice, or whatever channel you use to communicate.</w:t>
+      </w:r>
+    </w:p>
+    <w:p>
+      <w:pPr>
+        <w:pStyle w:val="ListParagraph"/>
+        <w:numPr>
+          <w:ilvl w:val="0"/>
+          <w:numId w:val="2"/>
+        </w:numPr>
+        <w:spacing w:after="60" w:before="60"/>
+      </w:pPr>
+      <w:r>
+        <w:rPr>
+          <w:rFonts w:ascii="Calibri" w:cs="Calibri" w:eastAsia="Calibri" w:hAnsi="Calibri"/>
+          <w:b/>
+          <w:bCs/>
+          <w:color w:val="1a1a1a"/>
+          <w:sz w:val="20"/>
+          <w:szCs w:val="20"/>
+        </w:rPr>
+        <w:t xml:space="preserve">AlwaysReady never sends on your behalf</w:t>
+      </w:r>
+      <w:r>
+        <w:rPr>
+          <w:rFonts w:ascii="Calibri" w:cs="Calibri" w:eastAsia="Calibri" w:hAnsi="Calibri"/>
+          <w:b w:val="false"/>
+          <w:bCs w:val="false"/>
+          <w:color w:val="1a1a1a"/>
+          <w:sz w:val="20"/>
+          <w:szCs w:val="20"/>
+        </w:rPr>
+        <w:t xml:space="preserve"> — This is a drafting tool, not an email platform. You keep full control over what goes out and how.</w:t>
+      </w:r>
+    </w:p>
+    <w:p>
+      <w:pPr>
+        <w:pStyle w:val="ListParagraph"/>
+        <w:numPr>
+          <w:ilvl w:val="0"/>
+          <w:numId w:val="2"/>
+        </w:numPr>
+        <w:spacing w:after="60" w:before="60"/>
+      </w:pPr>
+      <w:r>
+        <w:rPr>
+          <w:rFonts w:ascii="Calibri" w:cs="Calibri" w:eastAsia="Calibri" w:hAnsi="Calibri"/>
+          <w:b/>
+          <w:bCs/>
+          <w:color w:val="1a1a1a"/>
+          <w:sz w:val="20"/>
+          <w:szCs w:val="20"/>
+        </w:rPr>
+        <w:t xml:space="preserve">Monthly usage limit</w:t>
+      </w:r>
+      <w:r>
+        <w:rPr>
+          <w:rFonts w:ascii="Calibri" w:cs="Calibri" w:eastAsia="Calibri" w:hAnsi="Calibri"/>
+          <w:b w:val="false"/>
+          <w:bCs w:val="false"/>
+          <w:color w:val="1a1a1a"/>
+          <w:sz w:val="20"/>
+          <w:szCs w:val="20"/>
+        </w:rPr>
+        <w:t xml:space="preserve"> — Each organisation can generate up to 10 newsletter drafts per calendar month, keeping costs predictable and the feature sustainable.</w:t>
+      </w:r>
+    </w:p>
+    <w:p>
+      <w:pPr>
+        <w:pStyle w:val="ListParagraph"/>
+        <w:numPr>
+          <w:ilvl w:val="0"/>
+          <w:numId w:val="2"/>
+        </w:numPr>
+        <w:spacing w:after="60" w:before="60"/>
+      </w:pPr>
+      <w:r>
+        <w:rPr>
+          <w:rFonts w:ascii="Calibri" w:cs="Calibri" w:eastAsia="Calibri" w:hAnsi="Calibri"/>
+          <w:b/>
+          <w:bCs/>
+          <w:color w:val="1a1a1a"/>
+          <w:sz w:val="20"/>
+          <w:szCs w:val="20"/>
+        </w:rPr>
+        <w:t xml:space="preserve">Admin access only</w:t>
+      </w:r>
+      <w:r>
+        <w:rPr>
+          <w:rFonts w:ascii="Calibri" w:cs="Calibri" w:eastAsia="Calibri" w:hAnsi="Calibri"/>
+          <w:b w:val="false"/>
+          <w:bCs w:val="false"/>
+          <w:color w:val="1a1a1a"/>
+          <w:sz w:val="20"/>
+          <w:szCs w:val="20"/>
+        </w:rPr>
+        <w:t xml:space="preserve"> — Newsletter drafting is available to organisation admins. Staff and viewer logins do not have access.</w:t>
       </w:r>
     </w:p>
     <w:p>

</xml_diff>

<commit_message>
docs: add mock inspection section to feature list + marketing handoff
</commit_message>
<xml_diff>
--- a/docs/alwaysready-feature-list.docx
+++ b/docs/alwaysready-feature-list.docx
@@ -3516,6 +3516,159 @@
           <w:szCs w:val="20"/>
         </w:rPr>
         <w:t xml:space="preserve"> — Newsletter drafting is available to organisation admins. Staff and viewer logins do not have access.</w:t>
+      </w:r>
+    </w:p>
+    <w:p>
+      <w:pPr>
+        <w:pStyle w:val="Heading2"/>
+      </w:pPr>
+      <w:r>
+        <w:t>15. Mock Inspections</w:t>
+      </w:r>
+    </w:p>
+    <w:p>
+      <w:pPr>
+        <w:pStyle w:val="Normal"/>
+      </w:pPr>
+      <w:r>
+        <w:rPr>
+          <w:i/>
+          <w:iCs/>
+        </w:rPr>
+        <w:t>A self-assessment tool that steps care managers through their KLOEs in the same structure a CQC inspector would use. Produces a prioritised action plan. For guidance only — does not represent the view of CQC.</w:t>
+      </w:r>
+    </w:p>
+    <w:p>
+      <w:pPr>
+        <w:pStyle w:val="ListParagraph"/>
+        <w:numPr>
+          <w:ilvl w:val="0"/>
+          <w:numId w:val="1"/>
+        </w:numPr>
+      </w:pPr>
+      <w:r>
+        <w:rPr>
+          <w:b/>
+          <w:bCs/>
+        </w:rPr>
+        <w:t xml:space="preserve">Full or partial inspection — </w:t>
+      </w:r>
+      <w:r>
+        <w:t>Run a full mock inspection covering all five key questions, or a focused partial inspection on one key question — matching how CQC conducts focused inspections for providers rated Good or above.</w:t>
+      </w:r>
+    </w:p>
+    <w:p>
+      <w:pPr>
+        <w:pStyle w:val="ListParagraph"/>
+        <w:numPr>
+          <w:ilvl w:val="0"/>
+          <w:numId w:val="1"/>
+        </w:numPr>
+      </w:pPr>
+      <w:r>
+        <w:rPr>
+          <w:b/>
+          <w:bCs/>
+        </w:rPr>
+        <w:t xml:space="preserve">Steps through every KLOE and I statement — </w:t>
+      </w:r>
+      <w:r>
+        <w:t>Rate each I statement as Met, Partial, or Not Met. Add notes. Then give each KLOE an overall rating: Outstanding, Good, Requires Improvement, or Inadequate.</w:t>
+      </w:r>
+    </w:p>
+    <w:p>
+      <w:pPr>
+        <w:pStyle w:val="ListParagraph"/>
+        <w:numPr>
+          <w:ilvl w:val="0"/>
+          <w:numId w:val="1"/>
+        </w:numPr>
+      </w:pPr>
+      <w:r>
+        <w:rPr>
+          <w:b/>
+          <w:bCs/>
+        </w:rPr>
+        <w:t xml:space="preserve">Three-tier action plan — </w:t>
+      </w:r>
+      <w:r>
+        <w:t>On completion, a report is generated with findings by key question and a prioritised action plan: Must Address, Strengthen Before Inspection, and Maintain.</w:t>
+      </w:r>
+    </w:p>
+    <w:p>
+      <w:pPr>
+        <w:pStyle w:val="ListParagraph"/>
+        <w:numPr>
+          <w:ilvl w:val="0"/>
+          <w:numId w:val="1"/>
+        </w:numPr>
+      </w:pPr>
+      <w:r>
+        <w:rPr>
+          <w:b/>
+          <w:bCs/>
+        </w:rPr>
+        <w:t xml:space="preserve">Forward-looking language — </w:t>
+      </w:r>
+      <w:r>
+        <w:t>Every action is written as “you need to…” and “we recommend…” — constructive and directive, not a list of failures.</w:t>
+      </w:r>
+    </w:p>
+    <w:p>
+      <w:pPr>
+        <w:pStyle w:val="ListParagraph"/>
+        <w:numPr>
+          <w:ilvl w:val="0"/>
+          <w:numId w:val="1"/>
+        </w:numPr>
+      </w:pPr>
+      <w:r>
+        <w:rPr>
+          <w:b/>
+          <w:bCs/>
+        </w:rPr>
+        <w:t xml:space="preserve">Print or save as PDF — </w:t>
+      </w:r>
+      <w:r>
+        <w:t>The completed report can be printed or saved as a PDF for sharing with your management team, trustees, or board.</w:t>
+      </w:r>
+    </w:p>
+    <w:p>
+      <w:pPr>
+        <w:pStyle w:val="ListParagraph"/>
+        <w:numPr>
+          <w:ilvl w:val="0"/>
+          <w:numId w:val="1"/>
+        </w:numPr>
+      </w:pPr>
+      <w:r>
+        <w:rPr>
+          <w:b/>
+          <w:bCs/>
+        </w:rPr>
+        <w:t xml:space="preserve">Admin access only — </w:t>
+      </w:r>
+      <w:r>
+        <w:t>Mock inspections are available to organisation admins. Included in the standard subscription.</w:t>
+      </w:r>
+    </w:p>
+    <w:p>
+      <w:pPr>
+        <w:pStyle w:val="ListParagraph"/>
+        <w:numPr>
+          <w:ilvl w:val="0"/>
+          <w:numId w:val="1"/>
+        </w:numPr>
+      </w:pPr>
+      <w:r>
+        <w:rPr>
+          <w:b/>
+          <w:bCs/>
+        </w:rPr>
+        <w:t xml:space="preserve">Disclaimer built in — </w:t>
+      </w:r>
+      <w:r>
+        <w:t>A clear disclaimer appears at the start of every mock inspection and on every report: ratings are for self-assessment guidance only and do not represent the view of CQC.</w:t>
       </w:r>
     </w:p>
     <w:p>

</xml_diff>